<commit_message>
Retire the old-format sign-off sets of BRD-02, BRD-03, BRD-06 and BRD-11: the FRS in BDOI's format and its review workbooks are the only documents
The four set folders are removed from the drops (38 files). brand.py maps the retired BRDs to their BDOI-format pack (BDOI_FRS_SETS, RETIRED_SETS, refuse_retired); the sign-off, test plan, guide deck, UX deck and configuration input builders refuse these BRDs without --force; check_pack refuses a retired folder that reappears or a missing BDOI-format FRS; the drop indexes and the Drop 0 closure summary point to the BDOI-format pack. Closure set v2.1 rebuilt (new seed tables listed as records, employees, legacy accounts and payees claimed, CCM and MFT parameter wording); BRD-04 and BRD-05 test plans rebuilt with the BRD-02 test cases and traceability workbook as their reference.
</commit_message>
<xml_diff>
--- a/docs/deliverables/out/Drop-0_Setup_and_Data_Migration/Drop-0_Closure/02_BIBS_Drop-0_Closure_Summary_v2.1.docx
+++ b/docs/deliverables/out/Drop-0_Setup_and_Data_Migration/Drop-0_Closure/02_BIBS_Drop-0_Closure_Summary_v2.1.docx
@@ -836,7 +836,7 @@
               <w:rPr>
                 <w:sz w:val="18"/>
               </w:rPr>
-              <w:t>Aligned with the three Drop 0 sign-off sets v2.1 (BRD versions of 8 October 2026); the group and inter-company input removed (BIBS is specific to BDOI as an insurance broker); the master data and configuration upload templates v1.1 named as the way BDOI provides the inputs</w:t>
+              <w:t>Aligned with the three Drop 0 sets (BRD versions of 8 October 2026); for BRD-03 and BRD-11 the FRS in BDOI's format (v1.2, v1.3) with its review workbooks replaces the earlier sign-off set (decision of the BIBS Product Owner, 10 October 2026); the group and inter-company input removed (BIBS is specific to BDOI as an insurance broker); the master data and configuration upload templates v1.1 named as the way BDOI provides the inputs</w:t>
             </w:r>
           </w:p>
         </w:tc>
@@ -1858,7 +1858,7 @@
       </w:pPr>
       <w:hyperlink w:anchor="_Toc000103" w:history="1">
         <w:r>
-          <w:t xml:space="preserve">3 The three sign-off sets</w:t>
+          <w:t xml:space="preserve">3 The three Drop 0 sets</w:t>
         </w:r>
         <w:r>
           <w:t xml:space="preserve">	</w:t>
@@ -2242,14 +2242,14 @@
       <w:bookmarkStart w:id="103" w:name="_Toc000103"/>
       <w:r>
         <w:rPr/>
-        <w:t>3 The three sign-off sets</w:t>
+        <w:t>3 The three Drop 0 sets</w:t>
       </w:r>
       <w:bookmarkEnd w:id="103"/>
     </w:p>
     <w:p>
       <w:r>
         <w:rPr/>
-        <w:t>Each set is issued as one release set in its own folder of Drop 0 and is signed as one unit by the roles of its BRD approval sheet (the Who signs what chapter of its 00 Start Here): iorta TechNXT prepares it, the business units provide the input and review their parts, BDOI IT reviews the interfaces, the user access and the Technical Specification (a separate document), the Program Manager of Business Project Services reviews the traceability and the completeness, and the Product Owner approves the whole set. The sets hold business content only. Signing a set freezes its screens, fields, rules, messages, notifications and interface contract as specified.</w:t>
+        <w:t>Drop 0 is confirmed through three sets. For BRD-03 Product Maintenance and BRD-11 User Access Maintenance the document is the Functional Requirements Specification in BDOI's format, kept with its review workbooks (business unit requirements collection, fit-gap against the BRD, test cases and traceability, change request register, walkthrough users) in the programme folder BDOI_Template_FRS; it replaces the earlier sign-off set of each BRD, and its Signoff Sheet names the signatories. BRD-13 Data Migration is issued as one release set in its own folder of Drop 0. Each set is signed as one unit by the roles of its BRD approval sheet: iorta TechNXT prepares it, the business units provide the input and review their parts, BDOI IT reviews the interfaces, the user access and the Technical Specification (a separate document), the Program Manager of Business Project Services reviews the traceability and the completeness, and the Product Owner approves the whole set. The sets hold business content only. Signing a set freezes its screens, fields, rules, messages, notifications and interface contract as specified.</w:t>
       </w:r>
     </w:p>
     <w:p>
@@ -2267,7 +2267,7 @@
       </w:r>
       <w:r>
         <w:rPr/>
-        <w:t>The three sign-off sets of Drop 0</w:t>
+        <w:t>The three Drop 0 sets</w:t>
       </w:r>
     </w:p>
     <w:tbl>
@@ -2319,7 +2319,7 @@
                 <w:color w:val="FFFFFF"/>
                 <w:sz w:val="15"/>
               </w:rPr>
-              <w:t>Sign-off set</w:t>
+              <w:t>Set</w:t>
             </w:r>
           </w:p>
         </w:tc>
@@ -2476,7 +2476,7 @@
               <w:rPr>
                 <w:sz w:val="15"/>
               </w:rPr>
-              <w:t>00_BIBS_StartHere_BRD-03_Product_Maintenance_v2.1.docx</w:t>
+              <w:t>BIBS_CR_BRD-03_Change_Request_Register_v1.0.xlsx</w:t>
             </w:r>
           </w:p>
           <w:p>
@@ -2494,7 +2494,7 @@
               <w:rPr>
                 <w:sz w:val="15"/>
               </w:rPr>
-              <w:t>01_BIBS_GuideDeck_BRD-03_Product_Maintenance_v2.1.pptx</w:t>
+              <w:t>BIBS_FRS-BDOI_BRD-03_Product_Maintenance_v1.2.docx</w:t>
             </w:r>
           </w:p>
           <w:p>
@@ -2512,7 +2512,7 @@
               <w:rPr>
                 <w:sz w:val="15"/>
               </w:rPr>
-              <w:t>02_BIBS_FRS_BRD-03_Product_Maintenance_v2.1.docx</w:t>
+              <w:t>BIBS_FRS-BDOI_BRD-03_Product_Maintenance_v1.2_Changes_Highlighted.docx</w:t>
             </w:r>
           </w:p>
           <w:p>
@@ -2530,7 +2530,7 @@
               <w:rPr>
                 <w:sz w:val="15"/>
               </w:rPr>
-              <w:t>03_BIBS_Signoff_BRD-03_Product_Maintenance_v2.1.xlsx</w:t>
+              <w:t>BIBS_FitGap_BRD-03_BRD_vs_OOTB_vs_Best_Practice_v1.0.xlsx</w:t>
             </w:r>
           </w:p>
           <w:p>
@@ -2548,7 +2548,7 @@
               <w:rPr>
                 <w:sz w:val="15"/>
               </w:rPr>
-              <w:t>04_BIBS_TestPlan_BRD-03_Product_Maintenance_v2.1.xlsx</w:t>
+              <w:t>BIBS_Inputs_BRD-03_Business_Unit_Requirements_Collection_v1.0.xlsx</w:t>
             </w:r>
           </w:p>
           <w:p>
@@ -2566,7 +2566,7 @@
               <w:rPr>
                 <w:sz w:val="15"/>
               </w:rPr>
-              <w:t>05_BIBS_TestPlan_BRD-03_Product_Maintenance_Summary_v2.1.docx</w:t>
+              <w:t>BIBS_RTM_BRD-03_Test_Cases_and_Traceability_v1.0.xlsx</w:t>
             </w:r>
           </w:p>
           <w:p>
@@ -2584,61 +2584,7 @@
               <w:rPr>
                 <w:sz w:val="15"/>
               </w:rPr>
-              <w:t>06_BIBS_Templates_BRD-03_Configuration_Inputs_v2.1.xlsx</w:t>
-            </w:r>
-          </w:p>
-          <w:p>
-            <w:pPr>
-              <w:pStyle w:val="BDOITable"/>
-              <w:ind w:left="170" w:hanging="170"/>
-            </w:pPr>
-            <w:r>
-              <w:rPr>
-                <w:sz w:val="15"/>
-              </w:rPr>
-              <w:t xml:space="preserve">• </w:t>
-            </w:r>
-            <w:r>
-              <w:rPr>
-                <w:sz w:val="15"/>
-              </w:rPr>
-              <w:t>07_BIBS_UXDeck_BRD-03_Product_Maintenance_v2.1.pptx</w:t>
-            </w:r>
-          </w:p>
-          <w:p>
-            <w:pPr>
-              <w:pStyle w:val="BDOITable"/>
-              <w:ind w:left="170" w:hanging="170"/>
-            </w:pPr>
-            <w:r>
-              <w:rPr>
-                <w:sz w:val="15"/>
-              </w:rPr>
-              <w:t xml:space="preserve">• </w:t>
-            </w:r>
-            <w:r>
-              <w:rPr>
-                <w:sz w:val="15"/>
-              </w:rPr>
-              <w:t>08_BIBS_UXScreens_BRD-03_Product_Maintenance_v2.1.xlsx</w:t>
-            </w:r>
-          </w:p>
-          <w:p>
-            <w:pPr>
-              <w:pStyle w:val="BDOITable"/>
-              <w:ind w:left="170" w:hanging="170"/>
-            </w:pPr>
-            <w:r>
-              <w:rPr>
-                <w:sz w:val="15"/>
-              </w:rPr>
-              <w:t xml:space="preserve">• </w:t>
-            </w:r>
-            <w:r>
-              <w:rPr>
-                <w:sz w:val="15"/>
-              </w:rPr>
-              <w:t>09_BIBS_UXScreens_BRD-03_Product_Maintenance_v2.1.zip</w:t>
+              <w:t>BIBS_UAT_BRD-03_Business_Unit_Walkthrough_Users_v1.0.xlsx</w:t>
             </w:r>
           </w:p>
         </w:tc>
@@ -2827,7 +2773,7 @@
               <w:rPr>
                 <w:sz w:val="15"/>
               </w:rPr>
-              <w:t>00_BIBS_StartHere_BRD-11_User_Access_Maintenance_v2.1.docx</w:t>
+              <w:t>BIBS_CR_BRD-11_Change_Request_Register_v1.0.xlsx</w:t>
             </w:r>
           </w:p>
           <w:p>
@@ -2845,7 +2791,7 @@
               <w:rPr>
                 <w:sz w:val="15"/>
               </w:rPr>
-              <w:t>01_BIBS_GuideDeck_BRD-11_User_Access_Maintenance_v2.1.pptx</w:t>
+              <w:t>BIBS_FRS-BDOI_BRD-11_User_Access_Maintenance_v1.3.docx</w:t>
             </w:r>
           </w:p>
           <w:p>
@@ -2863,7 +2809,7 @@
               <w:rPr>
                 <w:sz w:val="15"/>
               </w:rPr>
-              <w:t>02_BIBS_FRS_BRD-11_User_Access_Maintenance_v2.1.docx</w:t>
+              <w:t>BIBS_FRS-BDOI_BRD-11_User_Access_Maintenance_v1.3_Changes_Highlighted.docx</w:t>
             </w:r>
           </w:p>
           <w:p>
@@ -2881,7 +2827,7 @@
               <w:rPr>
                 <w:sz w:val="15"/>
               </w:rPr>
-              <w:t>03_BIBS_Signoff_BRD-11_User_Access_Maintenance_v2.1.xlsx</w:t>
+              <w:t>BIBS_FitGap_BRD-11_BRD_vs_OOTB_vs_Best_Practice_v1.0.xlsx</w:t>
             </w:r>
           </w:p>
           <w:p>
@@ -2899,7 +2845,7 @@
               <w:rPr>
                 <w:sz w:val="15"/>
               </w:rPr>
-              <w:t>04_BIBS_TestPlan_BRD-11_User_Access_Maintenance_v2.1.xlsx</w:t>
+              <w:t>BIBS_Inputs_BRD-11_Business_Unit_Requirements_Collection_v1.0.xlsx</w:t>
             </w:r>
           </w:p>
           <w:p>
@@ -2917,7 +2863,7 @@
               <w:rPr>
                 <w:sz w:val="15"/>
               </w:rPr>
-              <w:t>05_BIBS_TestPlan_BRD-11_User_Access_Maintenance_Summary_v2.1.docx</w:t>
+              <w:t>BIBS_RTM_BRD-11_Test_Cases_and_Traceability_v1.0.xlsx</w:t>
             </w:r>
           </w:p>
           <w:p>
@@ -2935,61 +2881,7 @@
               <w:rPr>
                 <w:sz w:val="15"/>
               </w:rPr>
-              <w:t>06_BIBS_Templates_BRD-11_Configuration_Inputs_v2.1.xlsx</w:t>
-            </w:r>
-          </w:p>
-          <w:p>
-            <w:pPr>
-              <w:pStyle w:val="BDOITable"/>
-              <w:ind w:left="170" w:hanging="170"/>
-            </w:pPr>
-            <w:r>
-              <w:rPr>
-                <w:sz w:val="15"/>
-              </w:rPr>
-              <w:t xml:space="preserve">• </w:t>
-            </w:r>
-            <w:r>
-              <w:rPr>
-                <w:sz w:val="15"/>
-              </w:rPr>
-              <w:t>07_BIBS_UXDeck_BRD-11_User_Access_Maintenance_v2.1.pptx</w:t>
-            </w:r>
-          </w:p>
-          <w:p>
-            <w:pPr>
-              <w:pStyle w:val="BDOITable"/>
-              <w:ind w:left="170" w:hanging="170"/>
-            </w:pPr>
-            <w:r>
-              <w:rPr>
-                <w:sz w:val="15"/>
-              </w:rPr>
-              <w:t xml:space="preserve">• </w:t>
-            </w:r>
-            <w:r>
-              <w:rPr>
-                <w:sz w:val="15"/>
-              </w:rPr>
-              <w:t>08_BIBS_UXScreens_BRD-11_User_Access_Maintenance_v2.1.xlsx</w:t>
-            </w:r>
-          </w:p>
-          <w:p>
-            <w:pPr>
-              <w:pStyle w:val="BDOITable"/>
-              <w:ind w:left="170" w:hanging="170"/>
-            </w:pPr>
-            <w:r>
-              <w:rPr>
-                <w:sz w:val="15"/>
-              </w:rPr>
-              <w:t xml:space="preserve">• </w:t>
-            </w:r>
-            <w:r>
-              <w:rPr>
-                <w:sz w:val="15"/>
-              </w:rPr>
-              <w:t>09_BIBS_UXScreens_BRD-11_User_Access_Maintenance_v2.1.zip</w:t>
+              <w:t>BIBS_UAT_BRD-11_Business_Unit_Walkthrough_Users_v1.0.xlsx</w:t>
             </w:r>
           </w:p>
         </w:tc>
@@ -3486,7 +3378,7 @@
     <w:p>
       <w:r>
         <w:rPr/>
-        <w:t>Each set closes with a chapter of proposed business rules and clarifications for confirmation: the points where the proposed rule differs from the BRD text or where BIBS needs a BDOI decision to complete the rule. The FRS of BRD-03 and BRD-11 also carry their open questions; the Data Migration Handbook carries its open decisions with the date each is needed by. The counts below are taken from those chapters.</w:t>
+        <w:t>Each set carries its proposed business rules and clarifications for confirmation: the points where the proposed rule differs from the BRD text or where BIBS needs a BDOI decision to complete the rule. The FRS of BRD-03 and BRD-11 also carry their open questions; the Data Migration Handbook carries its open decisions with the date each is needed by. The counts below are taken from those chapters.</w:t>
       </w:r>
     </w:p>
     <w:p>
@@ -8591,7 +8483,7 @@
               <w:rPr>
                 <w:sz w:val="17"/>
               </w:rPr>
-              <w:t>134</w:t>
+              <w:t>141</w:t>
             </w:r>
           </w:p>
         </w:tc>
@@ -8666,7 +8558,7 @@
               <w:rPr>
                 <w:sz w:val="17"/>
               </w:rPr>
-              <w:t>219</w:t>
+              <w:t>355</w:t>
             </w:r>
           </w:p>
         </w:tc>
@@ -8740,7 +8632,7 @@
               <w:rPr>
                 <w:sz w:val="17"/>
               </w:rPr>
-              <w:t>11</w:t>
+              <w:t>13</w:t>
             </w:r>
           </w:p>
         </w:tc>
@@ -8815,7 +8707,7 @@
               <w:rPr>
                 <w:sz w:val="17"/>
               </w:rPr>
-              <w:t>90</w:t>
+              <w:t>114</w:t>
             </w:r>
           </w:p>
         </w:tc>
@@ -8964,7 +8856,7 @@
               <w:rPr>
                 <w:sz w:val="17"/>
               </w:rPr>
-              <w:t>87</w:t>
+              <w:t>90</w:t>
             </w:r>
           </w:p>
         </w:tc>
@@ -11349,7 +11241,7 @@
       </w:r>
       <w:r>
         <w:rPr/>
-        <w:t>The three sign-off sets v2.0 of Drop 0 are issued: BRD-03 Product Maintenance, BRD-11 User Access Maintenance and BRD-13 Data Migration, each with its test plan.</w:t>
+        <w:t>The three Drop 0 sets are issued: the FRS in BDOI's format of BRD-03 Product Maintenance (v1.2) and of BRD-11 User Access Maintenance (v1.3), each with its review workbooks (business unit requirements collection, fit-gap, test cases and traceability, change request register, walkthrough users), and the BRD-13 Data Migration sign-off set v2.1 with its test plan.</w:t>
       </w:r>
     </w:p>
     <w:p>
@@ -11420,7 +11312,7 @@
       </w:r>
       <w:r>
         <w:rPr/>
-        <w:t>The sign-off certificate of each of the three sets is signed (BRD-13 by 30-Oct-2026, BRD-03 by 30-Nov-2026, BRD-11 by 1-Dec-2026).</w:t>
+        <w:t>The Signoff Sheet of the BRD-03 and BRD-11 FRS and the sign-off certificate of the BRD-13 set are signed (BRD-13 by 30-Oct-2026, BRD-03 by 30-Nov-2026, BRD-11 by 1-Dec-2026).</w:t>
       </w:r>
     </w:p>
     <w:p>
@@ -11500,7 +11392,7 @@
       </w:r>
       <w:r>
         <w:rPr/>
-        <w:t>The comments logs of the three sets are closed: answered, corrected in v2.1, or raised as change requests.</w:t>
+        <w:t>The review comments of the three sets are closed: answered, corrected in the next version of the document, or raised in the change request register.</w:t>
       </w:r>
     </w:p>
     <w:p>
@@ -11551,7 +11443,7 @@
       </w:r>
       <w:r>
         <w:rPr/>
-        <w:t>The BRD-1 New Business sign-off set v2.0 is issued (folder Drop-1_Transactional); its review and sign-off follow the same steps.</w:t>
+        <w:t>The BRD-1 New Business sign-off set v2.1 is issued (folder Drop-1_Transactional); its review and sign-off follow the same steps.</w:t>
       </w:r>
     </w:p>
     <w:p>
@@ -13466,7 +13358,7 @@
       </w:r>
       <w:r>
         <w:rPr/>
-        <w:t xml:space="preserve"> A question on a set is answered in the comments log of its sign-off workbook without changing the text; a correction is made once, in version 2.1 of the set, with the changed rows marked.</w:t>
+        <w:t xml:space="preserve"> A question on a set is answered in its review workbook (the comments log of the BRD-13 sign-off workbook) without changing the text; a correction is made once, in the next version of the document, with the changes marked.</w:t>
       </w:r>
     </w:p>
     <w:p>

</xml_diff>